<commit_message>
add file to cake.docx
</commit_message>
<xml_diff>
--- a/cake.docx
+++ b/cake.docx
@@ -6,15 +6,16 @@
       <w:pPr>
         <w:rPr>
           <w:rFonts w:ascii="TH SarabunPSK" w:hAnsi="TH SarabunPSK" w:cs="TH SarabunPSK"/>
-          <w:sz w:val="32"/>
-          <w:szCs w:val="32"/>
+          <w:sz w:val="44"/>
+          <w:szCs w:val="44"/>
         </w:rPr>
       </w:pPr>
+      <w:bookmarkStart w:id="0" w:name="_GoBack"/>
       <w:r>
         <w:rPr>
           <w:rFonts w:ascii="TH SarabunPSK" w:hAnsi="TH SarabunPSK" w:cs="TH SarabunPSK" w:hint="cs"/>
-          <w:sz w:val="32"/>
-          <w:szCs w:val="32"/>
+          <w:sz w:val="44"/>
+          <w:szCs w:val="44"/>
           <w:cs/>
         </w:rPr>
         <w:t>อยู่ไม่ไหว</w:t>
@@ -22,8 +23,8 @@
       <w:r>
         <w:rPr>
           <w:rFonts w:ascii="TH SarabunPSK" w:hAnsi="TH SarabunPSK" w:cs="TH SarabunPSK" w:hint="cs"/>
-          <w:sz w:val="32"/>
-          <w:szCs w:val="32"/>
+          <w:sz w:val="44"/>
+          <w:szCs w:val="44"/>
           <w:cs/>
         </w:rPr>
         <w:t xml:space="preserve"> อยู่ไม่ไหว บ้านนี้มันน่ากลัว กลั่ว กลั๊ว</w:t>
@@ -33,22 +34,65 @@
       <w:pPr>
         <w:rPr>
           <w:rFonts w:ascii="TH SarabunPSK" w:hAnsi="TH SarabunPSK" w:cs="TH SarabunPSK"/>
-          <w:sz w:val="32"/>
-          <w:szCs w:val="32"/>
-          <w:cs/>
+          <w:sz w:val="44"/>
+          <w:szCs w:val="44"/>
         </w:rPr>
       </w:pPr>
       <w:r>
         <w:rPr>
           <w:rFonts w:ascii="TH SarabunPSK" w:hAnsi="TH SarabunPSK" w:cs="TH SarabunPSK"/>
-          <w:sz w:val="32"/>
-          <w:szCs w:val="32"/>
+          <w:sz w:val="44"/>
+          <w:szCs w:val="44"/>
           <w:cs/>
         </w:rPr>
         <w:t>พี่ก็อยู่ของพี่เฉยๆ หนูมาหาพี่เอง</w:t>
       </w:r>
-      <w:bookmarkStart w:id="0" w:name="_GoBack"/>
+    </w:p>
+    <w:p>
+      <w:pPr>
+        <w:rPr>
+          <w:rFonts w:ascii="TH SarabunPSK" w:hAnsi="TH SarabunPSK" w:cs="TH SarabunPSK"/>
+          <w:sz w:val="44"/>
+          <w:szCs w:val="44"/>
+        </w:rPr>
+      </w:pPr>
+      <w:r>
+        <w:rPr>
+          <w:rFonts w:ascii="TH SarabunPSK" w:hAnsi="TH SarabunPSK" w:cs="TH SarabunPSK"/>
+          <w:sz w:val="44"/>
+          <w:szCs w:val="44"/>
+        </w:rPr>
+        <w:t xml:space="preserve">I say </w:t>
+      </w:r>
+      <w:proofErr w:type="spellStart"/>
+      <w:r>
+        <w:rPr>
+          <w:rFonts w:ascii="TH SarabunPSK" w:hAnsi="TH SarabunPSK" w:cs="TH SarabunPSK"/>
+          <w:sz w:val="44"/>
+          <w:szCs w:val="44"/>
+        </w:rPr>
+        <w:t>goodbeyy</w:t>
+      </w:r>
+      <w:proofErr w:type="spellEnd"/>
+      <w:r>
+        <w:rPr>
+          <w:rFonts w:ascii="TH SarabunPSK" w:hAnsi="TH SarabunPSK" w:cs="TH SarabunPSK"/>
+          <w:sz w:val="44"/>
+          <w:szCs w:val="44"/>
+        </w:rPr>
+        <w:t xml:space="preserve">   I say good </w:t>
+      </w:r>
+      <w:proofErr w:type="spellStart"/>
+      <w:r>
+        <w:rPr>
+          <w:rFonts w:ascii="TH SarabunPSK" w:hAnsi="TH SarabunPSK" w:cs="TH SarabunPSK"/>
+          <w:sz w:val="44"/>
+          <w:szCs w:val="44"/>
+        </w:rPr>
+        <w:t>beyyy</w:t>
+      </w:r>
       <w:bookmarkEnd w:id="0"/>
+      <w:proofErr w:type="spellEnd"/>
     </w:p>
     <w:sectPr>
       <w:pgSz w:w="12240" w:h="15840"/>

</xml_diff>